<commit_message>
Standardize D.E.E.D.S. name in Version 2 plan
</commit_message>
<xml_diff>
--- a/docs/Progress_Not_Perfection_Version_2_Plan.docx
+++ b/docs/Progress_Not_Perfection_Version_2_Plan.docx
@@ -193,7 +193,7 @@
                 <w:color w:val="1C2F27"/>
                 <w:sz w:val="20"/>
               </w:rPr>
-              <w:t>D.e.e.d.s</w:t>
+              <w:t>D.E.E.D.S.</w:t>
             </w:r>
           </w:p>
         </w:tc>
@@ -322,7 +322,7 @@
           <w:color w:val="1C2F27"/>
           <w:sz w:val="21"/>
         </w:rPr>
-        <w:t>Make D.e.e.d.s a useful personal assistant that responds to current PNP data.</w:t>
+        <w:t>Make D.E.E.D.S. a useful personal assistant that responds to current PNP data.</w:t>
       </w:r>
     </w:p>
     <w:p>
@@ -553,7 +553,7 @@
           <w:color w:val="1C2F27"/>
           <w:sz w:val="21"/>
         </w:rPr>
-        <w:t>D.e.e.d.s recommends, explains, and helps the user act. The user makes the decision.</w:t>
+        <w:t>D.E.E.D.S. recommends, explains, and helps the user act. The user makes the decision.</w:t>
       </w:r>
     </w:p>
     <w:p>
@@ -668,7 +668,7 @@
           <w:color w:val="1C2F27"/>
           <w:sz w:val="21"/>
         </w:rPr>
-        <w:t>Every D.e.e.d.s suggestion should show the evidence behind it, such as urgency, calendar timing, available energy, goal connection, or an approaching deadline.</w:t>
+        <w:t>Every D.E.E.D.S. suggestion should show the evidence behind it, such as urgency, calendar timing, available energy, goal connection, or an approaching deadline.</w:t>
       </w:r>
     </w:p>
     <w:p>
@@ -834,7 +834,7 @@
           <w:color w:val="1C2F27"/>
           <w:sz w:val="21"/>
         </w:rPr>
-        <w:t>D.e.e.d.s recommendations based on structured app data</w:t>
+        <w:t>D.E.E.D.S. recommendations based on structured app data</w:t>
       </w:r>
     </w:p>
     <w:p>
@@ -962,7 +962,7 @@
           <w:color w:val="1C2F27"/>
           <w:sz w:val="21"/>
         </w:rPr>
-        <w:t>D.e.e.d.s refreshes from current PNP data whenever it opens</w:t>
+        <w:t>D.E.E.D.S. refreshes from current PNP data whenever it opens</w:t>
       </w:r>
     </w:p>
     <w:p>
@@ -977,7 +977,7 @@
           <w:color w:val="1C2F27"/>
           <w:sz w:val="21"/>
         </w:rPr>
-        <w:t>D.e.e.d.s produces useful next-step guidance without requiring a paid inference service</w:t>
+        <w:t>D.E.E.D.S. produces useful next-step guidance without requiring a paid inference service</w:t>
       </w:r>
     </w:p>
     <w:p>
@@ -1248,7 +1248,7 @@
           <w:color w:val="1C2F27"/>
           <w:sz w:val="21"/>
         </w:rPr>
-        <w:t>D.e.e.d.s</w:t>
+        <w:t>D.E.E.D.S.</w:t>
       </w:r>
     </w:p>
     <w:p>
@@ -1527,7 +1527,7 @@
         <w:pStyle w:val="Heading1"/>
       </w:pPr>
       <w:r>
-        <w:t>6. D.e.e.d.s Version 2</w:t>
+        <w:t>6. D.E.E.D.S. Version 2</w:t>
       </w:r>
     </w:p>
     <w:p>
@@ -1542,7 +1542,7 @@
           <w:color w:val="1C2F27"/>
           <w:sz w:val="21"/>
         </w:rPr>
-        <w:t>D.e.e.d.s becomes the decision and guidance layer across PNP.</w:t>
+        <w:t>D.E.E.D.S. becomes the decision and guidance layer across PNP.</w:t>
       </w:r>
     </w:p>
     <w:p>
@@ -2115,7 +2115,7 @@
           <w:color w:val="1C2F27"/>
           <w:sz w:val="21"/>
         </w:rPr>
-        <w:t>D.e.e.d.s should rank suggestions in this order:</w:t>
+        <w:t>D.E.E.D.S. should rank suggestions in this order:</w:t>
       </w:r>
     </w:p>
     <w:p>
@@ -3903,7 +3903,7 @@
         <w:pStyle w:val="Heading2"/>
       </w:pPr>
       <w:r>
-        <w:t>Phase 3: D.e.e.d.s core</w:t>
+        <w:t>Phase 3: D.E.E.D.S. core</w:t>
       </w:r>
     </w:p>
     <w:p>
@@ -4461,7 +4461,7 @@
           <w:color w:val="1C2F27"/>
           <w:sz w:val="21"/>
         </w:rPr>
-        <w:t>D.e.e.d.s deterministic assistant core</w:t>
+        <w:t>D.E.E.D.S. deterministic assistant core</w:t>
       </w:r>
     </w:p>
     <w:p>
@@ -4995,7 +4995,7 @@
           <w:color w:val="1C2F27"/>
           <w:sz w:val="21"/>
         </w:rPr>
-        <w:t xml:space="preserve"> D.e.e.d.s becomes noisy, opaque, or overconfident.</w:t>
+        <w:t xml:space="preserve"> D.E.E.D.S. becomes noisy, opaque, or overconfident.</w:t>
       </w:r>
     </w:p>
     <w:p>
@@ -5118,7 +5118,7 @@
           <w:color w:val="1C2F27"/>
           <w:sz w:val="21"/>
         </w:rPr>
-        <w:t>D.e.e.d.s refreshes on open and responds to current PNP changes</w:t>
+        <w:t>D.E.E.D.S. refreshes on open and responds to current PNP changes</w:t>
       </w:r>
     </w:p>
     <w:p>
@@ -5307,7 +5307,7 @@
           <w:color w:val="1C2F27"/>
           <w:sz w:val="21"/>
         </w:rPr>
-        <w:t>Build the deterministic D.e.e.d.s ranking prototype.</w:t>
+        <w:t>Build the deterministic D.E.E.D.S. ranking prototype.</w:t>
       </w:r>
     </w:p>
     <w:p>

</xml_diff>